<commit_message>
Fix: Mapeo de variables en main.py y formato de fechas corregido para la plantilla Auto-Auto
</commit_message>
<xml_diff>
--- a/templates/Borrador_Demanda_Auto_Auto.docx
+++ b/templates/Borrador_Demanda_Auto_Auto.docx
@@ -1546,39 +1546,56 @@
         </w:rPr>
         <w:t xml:space="preserve"> </w:t>
       </w:r>
-      <w:sdt>
-        <w:sdtPr>
-          <w:rPr>
-            <w:rFonts w:ascii="Times New Roman" w:eastAsia="Times New Roman" w:hAnsi="Times New Roman" w:cs="Times New Roman"/>
-            <w:sz w:val="24"/>
-            <w:szCs w:val="24"/>
-          </w:rPr>
-          <w:alias w:val="NombreActor_1"/>
-          <w:tag w:val="NombreActor_1"/>
-          <w:id w:val="-1094771514"/>
-          <w:lock w:val="contentLocked"/>
-          <w:placeholder>
-            <w:docPart w:val="550971BDE7944E54A46C5B14740AD647"/>
-          </w:placeholder>
-          <w:showingPlcHdr/>
-          <w:text/>
-        </w:sdtPr>
-        <w:sdtContent>
-          <w:r>
-            <w:rPr>
-              <w:rStyle w:val="Textodelmarcadordeposicin"/>
-            </w:rPr>
-            <w:t>Haga clic o pulse aquí para escribir texto.</w:t>
-          </w:r>
-        </w:sdtContent>
-      </w:sdt>
-      <w:r>
-        <w:rPr>
-          <w:rFonts w:ascii="Times New Roman" w:eastAsia="Times New Roman" w:hAnsi="Times New Roman" w:cs="Times New Roman"/>
-          <w:sz w:val="24"/>
-          <w:szCs w:val="24"/>
-        </w:rPr>
-        <w:t>sino a una distracción sumada a una excesiva velocidad y una indebida distancia por parte del demandado.</w:t>
+      <w:r>
+        <w:rPr>
+          <w:rFonts w:ascii="Times New Roman" w:eastAsia="Times New Roman" w:hAnsi="Times New Roman" w:cs="Times New Roman"/>
+          <w:b/>
+          <w:bCs/>
+          <w:sz w:val="24"/>
+          <w:szCs w:val="24"/>
+          <w:highlight w:val="yellow"/>
+        </w:rPr>
+        <w:t>{{</w:t>
+      </w:r>
+      <w:proofErr w:type="spellStart"/>
+      <w:r>
+        <w:rPr>
+          <w:rFonts w:ascii="Times New Roman" w:eastAsia="Times New Roman" w:hAnsi="Times New Roman" w:cs="Times New Roman"/>
+          <w:sz w:val="24"/>
+          <w:szCs w:val="24"/>
+          <w:highlight w:val="yellow"/>
+        </w:rPr>
+        <w:t>NombreActor</w:t>
+      </w:r>
+      <w:proofErr w:type="spellEnd"/>
+      <w:r>
+        <w:rPr>
+          <w:rFonts w:ascii="Times New Roman" w:eastAsia="Times New Roman" w:hAnsi="Times New Roman" w:cs="Times New Roman"/>
+          <w:b/>
+          <w:bCs/>
+          <w:sz w:val="24"/>
+          <w:szCs w:val="24"/>
+          <w:highlight w:val="yellow"/>
+        </w:rPr>
+        <w:t>}}</w:t>
+      </w:r>
+      <w:r>
+        <w:rPr>
+          <w:rFonts w:ascii="Times New Roman" w:eastAsia="Times New Roman" w:hAnsi="Times New Roman" w:cs="Times New Roman"/>
+          <w:b/>
+          <w:bCs/>
+          <w:sz w:val="24"/>
+          <w:szCs w:val="24"/>
+        </w:rPr>
+        <w:t xml:space="preserve"> s</w:t>
+      </w:r>
+      <w:r>
+        <w:rPr>
+          <w:rFonts w:ascii="Times New Roman" w:eastAsia="Times New Roman" w:hAnsi="Times New Roman" w:cs="Times New Roman"/>
+          <w:sz w:val="24"/>
+          <w:szCs w:val="24"/>
+        </w:rPr>
+        <w:t>ino a una distracción sumada a una excesiva velocidad y una indebida distancia por parte del demandado.</w:t>
       </w:r>
     </w:p>
     <w:p>
@@ -2665,8 +2682,18 @@
           <w:sz w:val="24"/>
           <w:szCs w:val="24"/>
         </w:rPr>
-        <w:t>., Sala B, 8/8/96, “Zapatero, Osca H. c/Cimino, Jorge s/daños y perjuicios”).-</w:t>
-      </w:r>
+        <w:t>., Sala B, 8/8/96, “Zapatero, Osca H. c/Cimino, Jorge s/daños y perjuicios”</w:t>
+      </w:r>
+      <w:proofErr w:type="gramStart"/>
+      <w:r>
+        <w:rPr>
+          <w:rFonts w:ascii="Times New Roman" w:eastAsia="Times New Roman" w:hAnsi="Times New Roman" w:cs="Times New Roman"/>
+          <w:sz w:val="24"/>
+          <w:szCs w:val="24"/>
+        </w:rPr>
+        <w:t>).-</w:t>
+      </w:r>
+      <w:proofErr w:type="gramEnd"/>
     </w:p>
     <w:p>
       <w:pPr>
@@ -2725,8 +2752,18 @@
           <w:sz w:val="24"/>
           <w:szCs w:val="24"/>
         </w:rPr>
-        <w:t>., Sala B, 17/11/06, “Montenegro, Sara C. c/Olivari de Petti, Laura S. s/daños y perjuicios”).-</w:t>
-      </w:r>
+        <w:t>., Sala B, 17/11/06, “Montenegro, Sara C. c/Olivari de Petti, Laura S. s/daños y perjuicios”</w:t>
+      </w:r>
+      <w:proofErr w:type="gramStart"/>
+      <w:r>
+        <w:rPr>
+          <w:rFonts w:ascii="Times New Roman" w:eastAsia="Times New Roman" w:hAnsi="Times New Roman" w:cs="Times New Roman"/>
+          <w:sz w:val="24"/>
+          <w:szCs w:val="24"/>
+        </w:rPr>
+        <w:t>).-</w:t>
+      </w:r>
+      <w:proofErr w:type="gramEnd"/>
     </w:p>
     <w:p>
       <w:pPr>
@@ -2739,13 +2776,23 @@
           <w:szCs w:val="24"/>
         </w:rPr>
       </w:pPr>
-      <w:r>
-        <w:rPr>
-          <w:rFonts w:ascii="Times New Roman" w:eastAsia="Times New Roman" w:hAnsi="Times New Roman" w:cs="Times New Roman"/>
-          <w:sz w:val="24"/>
-          <w:szCs w:val="24"/>
-        </w:rPr>
-        <w:t>Asimismo El CCCN, mantiene en vigor la aseveración de que el riesgo de la cosa "</w:t>
+      <w:proofErr w:type="gramStart"/>
+      <w:r>
+        <w:rPr>
+          <w:rFonts w:ascii="Times New Roman" w:eastAsia="Times New Roman" w:hAnsi="Times New Roman" w:cs="Times New Roman"/>
+          <w:sz w:val="24"/>
+          <w:szCs w:val="24"/>
+        </w:rPr>
+        <w:t>Asimismo</w:t>
+      </w:r>
+      <w:proofErr w:type="gramEnd"/>
+      <w:r>
+        <w:rPr>
+          <w:rFonts w:ascii="Times New Roman" w:eastAsia="Times New Roman" w:hAnsi="Times New Roman" w:cs="Times New Roman"/>
+          <w:sz w:val="24"/>
+          <w:szCs w:val="24"/>
+        </w:rPr>
+        <w:t xml:space="preserve"> El CCCN, mantiene en vigor la aseveración de que el riesgo de la cosa "</w:t>
       </w:r>
       <w:r>
         <w:rPr>
@@ -2783,7 +2830,25 @@
           <w:sz w:val="24"/>
           <w:szCs w:val="24"/>
         </w:rPr>
-        <w:t>El fin específico de la figura del riesgo creado es posibilitar la indemnización del daño causado por el riesgo o vicio con indiferencia de toda idea de culpa. Es así que el riesgo creado regula la responsabilidad civil por el hecho de las cosas y constituye el principio rector de la materia. Ergo resulta responsable no sólo el conductor sino la titular registral del automóvil. Se cita jurisprudencia que avala nuestra postura:</w:t>
+        <w:t xml:space="preserve">El fin específico de la figura del riesgo creado es posibilitar la indemnización del daño causado por el riesgo o vicio con indiferencia de toda idea de culpa. Es así </w:t>
+      </w:r>
+      <w:proofErr w:type="gramStart"/>
+      <w:r>
+        <w:rPr>
+          <w:rFonts w:ascii="Times New Roman" w:eastAsia="Times New Roman" w:hAnsi="Times New Roman" w:cs="Times New Roman"/>
+          <w:sz w:val="24"/>
+          <w:szCs w:val="24"/>
+        </w:rPr>
+        <w:t>que</w:t>
+      </w:r>
+      <w:proofErr w:type="gramEnd"/>
+      <w:r>
+        <w:rPr>
+          <w:rFonts w:ascii="Times New Roman" w:eastAsia="Times New Roman" w:hAnsi="Times New Roman" w:cs="Times New Roman"/>
+          <w:sz w:val="24"/>
+          <w:szCs w:val="24"/>
+        </w:rPr>
+        <w:t xml:space="preserve"> el riesgo creado regula la responsabilidad civil por el hecho de las cosas y constituye el principio rector de la materia. Ergo resulta responsable no sólo el conductor sino la titular registral del automóvil. Se cita jurisprudencia que avala nuestra postura:</w:t>
       </w:r>
     </w:p>
     <w:p>
@@ -2807,8 +2872,36 @@
           <w:sz w:val="24"/>
           <w:szCs w:val="24"/>
         </w:rPr>
-        <w:t>El factor de atribución de la responsabilidad es objetivo, tal y como se deriva de lo establecido por los arts. 1721, y 1722 del Código Civil y Comercial (Ley 26.994). Sin perjuicio de señalar que el demandado, desplegó una conducta temeraria, conducir por la Ciudad de Buenos Aires, y Gran Buenos Aires, debe tomarse como una tarea que requiere la más absoluta precaución e idoneidad. Por lo tanto debe castigarse a quienes lo hacen de manera imprudente.-</w:t>
-      </w:r>
+        <w:t xml:space="preserve">El factor de atribución de la responsabilidad es objetivo, tal y como se deriva de lo establecido por los arts. 1721, y 1722 del Código Civil y Comercial (Ley 26.994). Sin perjuicio de señalar que el demandado, desplegó una conducta temeraria, conducir por la Ciudad de Buenos Aires, y Gran Buenos Aires, debe tomarse como una tarea que requiere la más absoluta precaución e idoneidad. Por lo </w:t>
+      </w:r>
+      <w:proofErr w:type="gramStart"/>
+      <w:r>
+        <w:rPr>
+          <w:rFonts w:ascii="Times New Roman" w:eastAsia="Times New Roman" w:hAnsi="Times New Roman" w:cs="Times New Roman"/>
+          <w:sz w:val="24"/>
+          <w:szCs w:val="24"/>
+        </w:rPr>
+        <w:t>tanto</w:t>
+      </w:r>
+      <w:proofErr w:type="gramEnd"/>
+      <w:r>
+        <w:rPr>
+          <w:rFonts w:ascii="Times New Roman" w:eastAsia="Times New Roman" w:hAnsi="Times New Roman" w:cs="Times New Roman"/>
+          <w:sz w:val="24"/>
+          <w:szCs w:val="24"/>
+        </w:rPr>
+        <w:t xml:space="preserve"> debe castigarse a quienes lo hacen de manera </w:t>
+      </w:r>
+      <w:proofErr w:type="gramStart"/>
+      <w:r>
+        <w:rPr>
+          <w:rFonts w:ascii="Times New Roman" w:eastAsia="Times New Roman" w:hAnsi="Times New Roman" w:cs="Times New Roman"/>
+          <w:sz w:val="24"/>
+          <w:szCs w:val="24"/>
+        </w:rPr>
+        <w:t>imprudente.-</w:t>
+      </w:r>
+      <w:proofErr w:type="gramEnd"/>
     </w:p>
     <w:p>
       <w:pPr>
@@ -2874,8 +2967,18 @@
           <w:szCs w:val="24"/>
         </w:rPr>
         <w:lastRenderedPageBreak/>
-        <w:t>Por lo expuesto y Jurisprudencia citada, solicito que oportunamente se haga lugar totalmente a la demanda instaurada, condenando al demandado al pago del capital reclamado, o lo que en más o menos resulte de las pruebas a producirse en autos, sus intereses, actualización monetaria en su caso, como los costos y costas del juicio.-</w:t>
-      </w:r>
+        <w:t xml:space="preserve">Por lo expuesto y Jurisprudencia citada, solicito que oportunamente se haga lugar totalmente a la demanda instaurada, condenando al demandado al pago del capital reclamado, o lo que en más o menos resulte de las pruebas a producirse en autos, sus intereses, actualización monetaria en su caso, como los costos y costas del </w:t>
+      </w:r>
+      <w:proofErr w:type="gramStart"/>
+      <w:r>
+        <w:rPr>
+          <w:rFonts w:ascii="Times New Roman" w:eastAsia="Times New Roman" w:hAnsi="Times New Roman" w:cs="Times New Roman"/>
+          <w:sz w:val="24"/>
+          <w:szCs w:val="24"/>
+        </w:rPr>
+        <w:t>juicio.-</w:t>
+      </w:r>
+      <w:proofErr w:type="gramEnd"/>
     </w:p>
     <w:p>
       <w:pPr>
@@ -3323,7 +3426,6 @@
         <w:t>IncapacidadFisicaPorcentaje</w:t>
       </w:r>
       <w:proofErr w:type="spellEnd"/>
-      <w:proofErr w:type="gramStart"/>
       <w:r>
         <w:rPr>
           <w:rFonts w:ascii="Segoe UI" w:hAnsi="Segoe UI" w:cs="Segoe UI"/>
@@ -3337,38 +3439,6 @@
       </w:r>
       <w:r>
         <w:rPr>
-          <w:rFonts w:ascii="Segoe UI" w:hAnsi="Segoe UI" w:cs="Segoe UI"/>
-          <w:color w:val="242424"/>
-          <w:sz w:val="23"/>
-          <w:szCs w:val="23"/>
-          <w:shd w:val="clear" w:color="auto" w:fill="FFFFFF"/>
-        </w:rPr>
-        <w:t xml:space="preserve"> </w:t>
-      </w:r>
-      <w:r>
-        <w:rPr>
-          <w:rFonts w:ascii="Times New Roman" w:eastAsia="Times New Roman" w:hAnsi="Times New Roman" w:cs="Times New Roman"/>
-          <w:b/>
-          <w:bCs/>
-          <w:sz w:val="24"/>
-          <w:szCs w:val="24"/>
-        </w:rPr>
-        <w:t xml:space="preserve"> </w:t>
-      </w:r>
-      <w:r>
-        <w:rPr>
-          <w:rFonts w:ascii="Times New Roman" w:eastAsia="Times New Roman" w:hAnsi="Times New Roman" w:cs="Times New Roman"/>
-          <w:b/>
-          <w:bCs/>
-          <w:sz w:val="24"/>
-          <w:szCs w:val="24"/>
-          <w:u w:val="single"/>
-        </w:rPr>
-        <w:t>%</w:t>
-      </w:r>
-      <w:proofErr w:type="gramEnd"/>
-      <w:r>
-        <w:rPr>
           <w:rFonts w:ascii="Times New Roman" w:eastAsia="Times New Roman" w:hAnsi="Times New Roman" w:cs="Times New Roman"/>
           <w:b/>
           <w:bCs/>
@@ -3716,7 +3786,6 @@
         <w:t>PorcentajeDanoPsicologico</w:t>
       </w:r>
       <w:proofErr w:type="spellEnd"/>
-      <w:proofErr w:type="gramStart"/>
       <w:r>
         <w:rPr>
           <w:rFonts w:ascii="Times New Roman" w:eastAsia="Times New Roman" w:hAnsi="Times New Roman" w:cs="Times New Roman"/>
@@ -3728,28 +3797,6 @@
         </w:rPr>
         <w:t>}}</w:t>
       </w:r>
-      <w:r>
-        <w:rPr>
-          <w:rFonts w:ascii="Times New Roman" w:eastAsia="Times New Roman" w:hAnsi="Times New Roman" w:cs="Times New Roman"/>
-          <w:b/>
-          <w:bCs/>
-          <w:sz w:val="24"/>
-          <w:szCs w:val="24"/>
-        </w:rPr>
-        <w:t xml:space="preserve">  </w:t>
-      </w:r>
-      <w:r>
-        <w:rPr>
-          <w:rFonts w:ascii="Times New Roman" w:eastAsia="Times New Roman" w:hAnsi="Times New Roman" w:cs="Times New Roman"/>
-          <w:b/>
-          <w:bCs/>
-          <w:sz w:val="24"/>
-          <w:szCs w:val="24"/>
-          <w:u w:val="single"/>
-        </w:rPr>
-        <w:t>%</w:t>
-      </w:r>
-      <w:proofErr w:type="gramEnd"/>
       <w:r>
         <w:rPr>
           <w:rFonts w:ascii="Times New Roman" w:eastAsia="Times New Roman" w:hAnsi="Times New Roman" w:cs="Times New Roman"/>
@@ -4398,16 +4445,6 @@
         </w:rPr>
         <w:t xml:space="preserve"> </w:t>
       </w:r>
-      <w:r>
-        <w:rPr>
-          <w:rFonts w:ascii="Times New Roman" w:eastAsia="Times New Roman" w:hAnsi="Times New Roman" w:cs="Times New Roman"/>
-          <w:b/>
-          <w:bCs/>
-          <w:sz w:val="24"/>
-          <w:szCs w:val="24"/>
-        </w:rPr>
-        <w:t>(</w:t>
-      </w:r>
       <w:proofErr w:type="gramStart"/>
       <w:r>
         <w:rPr>
@@ -4417,7 +4454,7 @@
           <w:sz w:val="24"/>
           <w:szCs w:val="24"/>
         </w:rPr>
-        <w:t xml:space="preserve">$  </w:t>
+        <w:t xml:space="preserve">( </w:t>
       </w:r>
       <w:r>
         <w:rPr>
@@ -5009,7 +5046,7 @@
           <w:szCs w:val="24"/>
           <w:u w:val="single"/>
         </w:rPr>
-        <w:t>($</w:t>
+        <w:t>(</w:t>
       </w:r>
       <w:r>
         <w:rPr>
@@ -6156,7 +6193,7 @@
           <w:sz w:val="24"/>
           <w:szCs w:val="24"/>
         </w:rPr>
-        <w:t xml:space="preserve"> ($</w:t>
+        <w:t xml:space="preserve"> (</w:t>
       </w:r>
       <w:r>
         <w:rPr>
@@ -6941,39 +6978,16 @@
         </w:rPr>
         <w:t>(</w:t>
       </w:r>
-      <w:proofErr w:type="gramStart"/>
-      <w:r>
-        <w:rPr>
-          <w:rFonts w:ascii="Times New Roman" w:eastAsia="Times New Roman" w:hAnsi="Times New Roman" w:cs="Times New Roman"/>
-          <w:b/>
-          <w:bCs/>
-          <w:sz w:val="24"/>
-          <w:szCs w:val="24"/>
-        </w:rPr>
-        <w:t xml:space="preserve">$  </w:t>
-      </w:r>
-      <w:r>
-        <w:rPr>
-          <w:rFonts w:ascii="Times New Roman" w:eastAsia="Times New Roman" w:hAnsi="Times New Roman" w:cs="Times New Roman"/>
-          <w:b/>
-          <w:bCs/>
-          <w:sz w:val="24"/>
-          <w:szCs w:val="24"/>
-          <w:highlight w:val="yellow"/>
-        </w:rPr>
-        <w:t>{</w:t>
-      </w:r>
-      <w:proofErr w:type="gramEnd"/>
-      <w:r>
-        <w:rPr>
-          <w:rFonts w:ascii="Times New Roman" w:eastAsia="Times New Roman" w:hAnsi="Times New Roman" w:cs="Times New Roman"/>
-          <w:b/>
-          <w:bCs/>
-          <w:sz w:val="24"/>
-          <w:szCs w:val="24"/>
-          <w:highlight w:val="yellow"/>
-        </w:rPr>
-        <w:t>{</w:t>
+      <w:r>
+        <w:rPr>
+          <w:rFonts w:ascii="Times New Roman" w:eastAsia="Times New Roman" w:hAnsi="Times New Roman" w:cs="Times New Roman"/>
+          <w:b/>
+          <w:bCs/>
+          <w:sz w:val="24"/>
+          <w:szCs w:val="24"/>
+          <w:highlight w:val="yellow"/>
+        </w:rPr>
+        <w:t>{{</w:t>
       </w:r>
       <w:proofErr w:type="spellStart"/>
       <w:r>
@@ -7349,7 +7363,7 @@
           <w:sz w:val="24"/>
           <w:szCs w:val="24"/>
         </w:rPr>
-        <w:t>($</w:t>
+        <w:t>(</w:t>
       </w:r>
       <w:r>
         <w:rPr>
@@ -10804,7 +10818,25 @@
           <w:szCs w:val="24"/>
           <w:highlight w:val="yellow"/>
         </w:rPr>
-        <w:t>DireccionTaller</w:t>
+        <w:t>Direcci</w:t>
+      </w:r>
+      <w:r>
+        <w:rPr>
+          <w:rFonts w:ascii="Times New Roman" w:eastAsia="Times New Roman" w:hAnsi="Times New Roman" w:cs="Times New Roman"/>
+          <w:sz w:val="24"/>
+          <w:szCs w:val="24"/>
+          <w:highlight w:val="yellow"/>
+        </w:rPr>
+        <w:t>ó</w:t>
+      </w:r>
+      <w:r>
+        <w:rPr>
+          <w:rFonts w:ascii="Times New Roman" w:eastAsia="Times New Roman" w:hAnsi="Times New Roman" w:cs="Times New Roman"/>
+          <w:sz w:val="24"/>
+          <w:szCs w:val="24"/>
+          <w:highlight w:val="yellow"/>
+        </w:rPr>
+        <w:t>nTaller</w:t>
       </w:r>
       <w:proofErr w:type="spellEnd"/>
       <w:proofErr w:type="gramStart"/>
@@ -10827,17 +10859,7 @@
           <w:sz w:val="24"/>
           <w:szCs w:val="24"/>
         </w:rPr>
-        <w:t xml:space="preserve"> </w:t>
-      </w:r>
-      <w:r>
-        <w:rPr>
-          <w:rFonts w:ascii="Times New Roman" w:eastAsia="Times New Roman" w:hAnsi="Times New Roman" w:cs="Times New Roman"/>
-          <w:b/>
-          <w:bCs/>
-          <w:sz w:val="24"/>
-          <w:szCs w:val="24"/>
-        </w:rPr>
-        <w:t xml:space="preserve">  </w:t>
+        <w:t xml:space="preserve">   </w:t>
       </w:r>
       <w:proofErr w:type="gramEnd"/>
       <w:r>
@@ -10848,7 +10870,7 @@
           <w:sz w:val="24"/>
           <w:szCs w:val="24"/>
         </w:rPr>
-        <w:t xml:space="preserve">                                     </w:t>
+        <w:t xml:space="preserve">                                  </w:t>
       </w:r>
       <w:proofErr w:type="gramStart"/>
       <w:r>
@@ -10868,7 +10890,55 @@
           <w:sz w:val="24"/>
           <w:szCs w:val="24"/>
         </w:rPr>
-        <w:t xml:space="preserve"> a efectos de que reconozca como auténtico el presupuesto de fecha  </w:t>
+        <w:t xml:space="preserve"> a efectos de que reconozca como auténtico el presupuesto de </w:t>
+      </w:r>
+      <w:proofErr w:type="gramStart"/>
+      <w:r>
+        <w:rPr>
+          <w:rFonts w:ascii="Times New Roman" w:eastAsia="Times New Roman" w:hAnsi="Times New Roman" w:cs="Times New Roman"/>
+          <w:sz w:val="24"/>
+          <w:szCs w:val="24"/>
+        </w:rPr>
+        <w:t xml:space="preserve">fecha  </w:t>
+      </w:r>
+      <w:r>
+        <w:rPr>
+          <w:rFonts w:ascii="Times New Roman" w:eastAsia="Times New Roman" w:hAnsi="Times New Roman" w:cs="Times New Roman"/>
+          <w:sz w:val="24"/>
+          <w:szCs w:val="24"/>
+          <w:highlight w:val="yellow"/>
+        </w:rPr>
+        <w:t>{</w:t>
+      </w:r>
+      <w:proofErr w:type="gramEnd"/>
+      <w:r>
+        <w:rPr>
+          <w:rFonts w:ascii="Times New Roman" w:eastAsia="Times New Roman" w:hAnsi="Times New Roman" w:cs="Times New Roman"/>
+          <w:sz w:val="24"/>
+          <w:szCs w:val="24"/>
+          <w:highlight w:val="yellow"/>
+        </w:rPr>
+        <w:t>{</w:t>
+      </w:r>
+      <w:proofErr w:type="spellStart"/>
+      <w:r>
+        <w:rPr>
+          <w:rFonts w:ascii="Times New Roman" w:eastAsia="Times New Roman" w:hAnsi="Times New Roman" w:cs="Times New Roman"/>
+          <w:sz w:val="24"/>
+          <w:szCs w:val="24"/>
+          <w:highlight w:val="yellow"/>
+        </w:rPr>
+        <w:t>FechaPresupuesto</w:t>
+      </w:r>
+      <w:proofErr w:type="spellEnd"/>
+      <w:r>
+        <w:rPr>
+          <w:rFonts w:ascii="Times New Roman" w:eastAsia="Times New Roman" w:hAnsi="Times New Roman" w:cs="Times New Roman"/>
+          <w:sz w:val="24"/>
+          <w:szCs w:val="24"/>
+          <w:highlight w:val="yellow"/>
+        </w:rPr>
+        <w:t>}}</w:t>
       </w:r>
       <w:r>
         <w:rPr>
@@ -11167,7 +11237,7 @@
           <w:szCs w:val="24"/>
           <w:highlight w:val="yellow"/>
         </w:rPr>
-        <w:t>FechaAtencionMedica</w:t>
+        <w:t>FechaMedica</w:t>
       </w:r>
       <w:proofErr w:type="spellEnd"/>
       <w:proofErr w:type="gramStart"/>
@@ -14099,23 +14169,13 @@
       </w:r>
       <w:r>
         <w:rPr>
-          <w:rFonts w:ascii="Segoe UI" w:hAnsi="Segoe UI" w:cs="Segoe UI"/>
-          <w:color w:val="242424"/>
-          <w:sz w:val="23"/>
-          <w:szCs w:val="23"/>
-          <w:shd w:val="clear" w:color="auto" w:fill="FFFFFF"/>
-        </w:rPr>
-        <w:t xml:space="preserve"> </w:t>
-      </w:r>
-      <w:r>
-        <w:rPr>
-          <w:rFonts w:ascii="Times New Roman" w:eastAsia="Times New Roman" w:hAnsi="Times New Roman" w:cs="Times New Roman"/>
-          <w:b/>
-          <w:bCs/>
-          <w:sz w:val="24"/>
-          <w:szCs w:val="24"/>
-        </w:rPr>
-        <w:t xml:space="preserve">%, </w:t>
+          <w:rFonts w:ascii="Times New Roman" w:eastAsia="Times New Roman" w:hAnsi="Times New Roman" w:cs="Times New Roman"/>
+          <w:b/>
+          <w:bCs/>
+          <w:sz w:val="24"/>
+          <w:szCs w:val="24"/>
+        </w:rPr>
+        <w:t xml:space="preserve">, </w:t>
       </w:r>
       <w:r>
         <w:rPr>
@@ -17250,6 +17310,7 @@
   <w:style w:type="character" w:default="1" w:styleId="Fuentedeprrafopredeter">
     <w:name w:val="Default Paragraph Font"/>
     <w:uiPriority w:val="1"/>
+    <w:semiHidden/>
     <w:unhideWhenUsed/>
   </w:style>
   <w:style w:type="table" w:default="1" w:styleId="Tablanormal">
@@ -17656,647 +17717,6 @@
 </w:styles>
 </file>
 
-<file path=word/glossary/document.xml><?xml version="1.0" encoding="utf-8"?>
-<w:glossaryDocument xmlns:wpc="http://schemas.microsoft.com/office/word/2010/wordprocessingCanvas" xmlns:cx="http://schemas.microsoft.com/office/drawing/2014/chartex" xmlns:cx1="http://schemas.microsoft.com/office/drawing/2015/9/8/chartex" xmlns:cx2="http://schemas.microsoft.com/office/drawing/2015/10/21/chartex" xmlns:cx3="http://schemas.microsoft.com/office/drawing/2016/5/9/chartex" xmlns:cx4="http://schemas.microsoft.com/office/drawing/2016/5/10/chartex" xmlns:cx5="http://schemas.microsoft.com/office/drawing/2016/5/11/chartex" xmlns:cx6="http://schemas.microsoft.com/office/drawing/2016/5/12/chartex" xmlns:cx7="http://schemas.microsoft.com/office/drawing/2016/5/13/chartex" xmlns:cx8="http://schemas.microsoft.com/office/drawing/2016/5/14/chartex" xmlns:mc="http://schemas.openxmlformats.org/markup-compatibility/2006" xmlns:aink="http://schemas.microsoft.com/office/drawing/2016/ink" xmlns:am3d="http://schemas.microsoft.com/office/drawing/2017/model3d" xmlns:o="urn:schemas-microsoft-com:office:office" xmlns:oel="http://schemas.microsoft.com/office/2019/extlst" xmlns:r="http://schemas.openxmlformats.org/officeDocument/2006/relationships" xmlns:m="http://schemas.openxmlformats.org/officeDocument/2006/math" xmlns:v="urn:schemas-microsoft-com:vml" xmlns:wp14="http://schemas.microsoft.com/office/word/2010/wordprocessingDrawing" xmlns:wp="http://schemas.openxmlformats.org/drawingml/2006/wordprocessingDrawing" xmlns:w10="urn:schemas-microsoft-com:office:word" xmlns:w="http://schemas.openxmlformats.org/wordprocessingml/2006/main" xmlns:w14="http://schemas.microsoft.com/office/word/2010/wordml" xmlns:w15="http://schemas.microsoft.com/office/word/2012/wordml" xmlns:w16cei="http://schemas.microsoft.com/office/word/2026/wordml/cei" xmlns:w16cex="http://schemas.microsoft.com/office/word/2018/wordml/cex" xmlns:w16cid="http://schemas.microsoft.com/office/word/2016/wordml/cid" xmlns:w16="http://schemas.microsoft.com/office/word/2018/wordml" xmlns:w16du="http://schemas.microsoft.com/office/word/2023/wordml/word16du" xmlns:w16sdtdh="http://schemas.microsoft.com/office/word/2020/wordml/sdtdatahash" xmlns:w16sdtfl="http://schemas.microsoft.com/office/word/2024/wordml/sdtformatlock" xmlns:w16se="http://schemas.microsoft.com/office/word/2015/wordml/symex" xmlns:wpg="http://schemas.microsoft.com/office/word/2010/wordprocessingGroup" xmlns:wpi="http://schemas.microsoft.com/office/word/2010/wordprocessingInk" xmlns:wne="http://schemas.microsoft.com/office/word/2006/wordml" xmlns:wps="http://schemas.microsoft.com/office/word/2010/wordprocessingShape" mc:Ignorable="w14 w15 w16se w16cid w16 w16cex w16sdtdh w16sdtfl w16du wp14">
-  <w:docParts>
-    <w:docPart>
-      <w:docPartPr>
-        <w:name w:val="550971BDE7944E54A46C5B14740AD647"/>
-        <w:category>
-          <w:name w:val="General"/>
-          <w:gallery w:val="placeholder"/>
-        </w:category>
-        <w:types>
-          <w:type w:val="bbPlcHdr"/>
-        </w:types>
-        <w:behaviors>
-          <w:behavior w:val="content"/>
-        </w:behaviors>
-        <w:guid w:val="{00C523BD-703E-4DBF-A1FF-E0AD43FF5824}"/>
-      </w:docPartPr>
-      <w:docPartBody>
-        <w:p>
-          <w:pPr>
-            <w:pStyle w:val="550971BDE7944E54A46C5B14740AD647"/>
-          </w:pPr>
-          <w:r>
-            <w:rPr>
-              <w:rStyle w:val="Textodelmarcadordeposicin"/>
-            </w:rPr>
-            <w:t>Haga clic o pulse aquí para escribir texto.</w:t>
-          </w:r>
-        </w:p>
-      </w:docPartBody>
-    </w:docPart>
-  </w:docParts>
-</w:glossaryDocument>
-</file>
-
-<file path=word/glossary/fontTable.xml><?xml version="1.0" encoding="utf-8"?>
-<w:fonts xmlns:mc="http://schemas.openxmlformats.org/markup-compatibility/2006" xmlns:r="http://schemas.openxmlformats.org/officeDocument/2006/relationships" xmlns:w="http://schemas.openxmlformats.org/wordprocessingml/2006/main" xmlns:w14="http://schemas.microsoft.com/office/word/2010/wordml" xmlns:w15="http://schemas.microsoft.com/office/word/2012/wordml" xmlns:w16cex="http://schemas.microsoft.com/office/word/2018/wordml/cex" xmlns:w16cid="http://schemas.microsoft.com/office/word/2016/wordml/cid" xmlns:w16="http://schemas.microsoft.com/office/word/2018/wordml" xmlns:w16du="http://schemas.microsoft.com/office/word/2023/wordml/word16du" xmlns:w16sdtdh="http://schemas.microsoft.com/office/word/2020/wordml/sdtdatahash" xmlns:w16sdtfl="http://schemas.microsoft.com/office/word/2024/wordml/sdtformatlock" xmlns:w16se="http://schemas.microsoft.com/office/word/2015/wordml/symex" mc:Ignorable="w14 w15 w16se w16cid w16 w16cex w16sdtdh w16sdtfl w16du">
-  <w:font w:name="Times New Roman">
-    <w:panose1 w:val="02020603050405020304"/>
-    <w:charset w:val="00"/>
-    <w:family w:val="roman"/>
-    <w:pitch w:val="variable"/>
-    <w:sig w:usb0="E0002EFF" w:usb1="C000785B" w:usb2="00000009" w:usb3="00000000" w:csb0="000001FF" w:csb1="00000000"/>
-  </w:font>
-  <w:font w:name="Arial">
-    <w:panose1 w:val="020B0604020202020204"/>
-    <w:charset w:val="00"/>
-    <w:family w:val="swiss"/>
-    <w:pitch w:val="variable"/>
-    <w:sig w:usb0="E0002EFF" w:usb1="C000785B" w:usb2="00000009" w:usb3="00000000" w:csb0="000001FF" w:csb1="00000000"/>
-  </w:font>
-  <w:font w:name="Calibri">
-    <w:panose1 w:val="020F0502020204030204"/>
-    <w:charset w:val="00"/>
-    <w:family w:val="swiss"/>
-    <w:pitch w:val="variable"/>
-    <w:sig w:usb0="E4002EFF" w:usb1="C200247B" w:usb2="00000009" w:usb3="00000000" w:csb0="000001FF" w:csb1="00000000"/>
-  </w:font>
-  <w:font w:name="Tahoma">
-    <w:panose1 w:val="020B0604030504040204"/>
-    <w:charset w:val="00"/>
-    <w:family w:val="swiss"/>
-    <w:pitch w:val="variable"/>
-    <w:sig w:usb0="E1002EFF" w:usb1="C000605B" w:usb2="00000029" w:usb3="00000000" w:csb0="000101FF" w:csb1="00000000"/>
-  </w:font>
-  <w:font w:name="Georgia">
-    <w:panose1 w:val="02040502050405020303"/>
-    <w:charset w:val="00"/>
-    <w:family w:val="roman"/>
-    <w:pitch w:val="variable"/>
-    <w:sig w:usb0="00000287" w:usb1="00000000" w:usb2="00000000" w:usb3="00000000" w:csb0="0000009F" w:csb1="00000000"/>
-  </w:font>
-  <w:font w:name="Segoe UI">
-    <w:panose1 w:val="020B0502040204020203"/>
-    <w:charset w:val="00"/>
-    <w:family w:val="swiss"/>
-    <w:pitch w:val="variable"/>
-    <w:sig w:usb0="E4002EFF" w:usb1="C000E47F" w:usb2="00000009" w:usb3="00000000" w:csb0="000001FF" w:csb1="00000000"/>
-  </w:font>
-  <w:font w:name="Cambria">
-    <w:panose1 w:val="02040503050406030204"/>
-    <w:charset w:val="00"/>
-    <w:family w:val="roman"/>
-    <w:pitch w:val="variable"/>
-    <w:sig w:usb0="E00006FF" w:usb1="420024FF" w:usb2="02000000" w:usb3="00000000" w:csb0="0000019F" w:csb1="00000000"/>
-  </w:font>
-  <w:font w:name="Aptos">
-    <w:charset w:val="00"/>
-    <w:family w:val="swiss"/>
-    <w:pitch w:val="variable"/>
-    <w:sig w:usb0="20000287" w:usb1="00000003" w:usb2="00000000" w:usb3="00000000" w:csb0="0000019F" w:csb1="00000000"/>
-  </w:font>
-  <w:font w:name="Aptos Display">
-    <w:charset w:val="00"/>
-    <w:family w:val="swiss"/>
-    <w:pitch w:val="variable"/>
-    <w:sig w:usb0="20000287" w:usb1="00000003" w:usb2="00000000" w:usb3="00000000" w:csb0="0000019F" w:csb1="00000000"/>
-  </w:font>
-</w:fonts>
-</file>
-
-<file path=word/glossary/settings.xml><?xml version="1.0" encoding="utf-8"?>
-<w:settings xmlns:mc="http://schemas.openxmlformats.org/markup-compatibility/2006" xmlns:o="urn:schemas-microsoft-com:office:office" xmlns:r="http://schemas.openxmlformats.org/officeDocument/2006/relationships" xmlns:m="http://schemas.openxmlformats.org/officeDocument/2006/math" xmlns:v="urn:schemas-microsoft-com:vml" xmlns:w10="urn:schemas-microsoft-com:office:word" xmlns:w="http://schemas.openxmlformats.org/wordprocessingml/2006/main" xmlns:w14="http://schemas.microsoft.com/office/word/2010/wordml" xmlns:w15="http://schemas.microsoft.com/office/word/2012/wordml" xmlns:w16cex="http://schemas.microsoft.com/office/word/2018/wordml/cex" xmlns:w16cid="http://schemas.microsoft.com/office/word/2016/wordml/cid" xmlns:w16="http://schemas.microsoft.com/office/word/2018/wordml" xmlns:w16du="http://schemas.microsoft.com/office/word/2023/wordml/word16du" xmlns:w16sdtdh="http://schemas.microsoft.com/office/word/2020/wordml/sdtdatahash" xmlns:w16sdtfl="http://schemas.microsoft.com/office/word/2024/wordml/sdtformatlock" xmlns:w16se="http://schemas.microsoft.com/office/word/2015/wordml/symex" xmlns:sl="http://schemas.openxmlformats.org/schemaLibrary/2006/main" mc:Ignorable="w14 w15 w16se w16cid w16 w16cex w16sdtdh w16sdtfl w16du">
-  <w:view w:val="normal"/>
-  <w:defaultTabStop w:val="708"/>
-  <w:hyphenationZone w:val="425"/>
-  <w:characterSpacingControl w:val="doNotCompress"/>
-  <w:compat>
-    <w:useFELayout/>
-    <w:compatSetting w:name="compatibilityMode" w:uri="http://schemas.microsoft.com/office/word" w:val="15"/>
-    <w:compatSetting w:name="overrideTableStyleFontSizeAndJustification" w:uri="http://schemas.microsoft.com/office/word" w:val="1"/>
-    <w:compatSetting w:name="enableOpenTypeFeatures" w:uri="http://schemas.microsoft.com/office/word" w:val="1"/>
-    <w:compatSetting w:name="doNotFlipMirrorIndents" w:uri="http://schemas.microsoft.com/office/word" w:val="1"/>
-    <w:compatSetting w:name="differentiateMultirowTableHeaders" w:uri="http://schemas.microsoft.com/office/word" w:val="1"/>
-    <w:compatSetting w:name="useWord2013TrackBottomHyphenation" w:uri="http://schemas.microsoft.com/office/word" w:val="0"/>
-  </w:compat>
-  <w:rsids>
-    <w:rsidRoot w:val="00CC1A07"/>
-    <w:rsid w:val="00041D44"/>
-    <w:rsid w:val="00197D8D"/>
-    <w:rsid w:val="001F7123"/>
-    <w:rsid w:val="0023643F"/>
-    <w:rsid w:val="002D2635"/>
-    <w:rsid w:val="003013EF"/>
-    <w:rsid w:val="00456CF0"/>
-    <w:rsid w:val="004A03B9"/>
-    <w:rsid w:val="0051368F"/>
-    <w:rsid w:val="00583ABF"/>
-    <w:rsid w:val="006219DF"/>
-    <w:rsid w:val="00691037"/>
-    <w:rsid w:val="007154D1"/>
-    <w:rsid w:val="00785BF8"/>
-    <w:rsid w:val="00814096"/>
-    <w:rsid w:val="0085258E"/>
-    <w:rsid w:val="008C43AA"/>
-    <w:rsid w:val="009027CB"/>
-    <w:rsid w:val="00916A31"/>
-    <w:rsid w:val="009367DC"/>
-    <w:rsid w:val="0096710B"/>
-    <w:rsid w:val="00A52A6D"/>
-    <w:rsid w:val="00A75757"/>
-    <w:rsid w:val="00A75DC2"/>
-    <w:rsid w:val="00AA1D63"/>
-    <w:rsid w:val="00AF0D34"/>
-    <w:rsid w:val="00B562E6"/>
-    <w:rsid w:val="00B96157"/>
-    <w:rsid w:val="00BE7891"/>
-    <w:rsid w:val="00C7140B"/>
-    <w:rsid w:val="00CC1A07"/>
-    <w:rsid w:val="00CD1EA4"/>
-    <w:rsid w:val="00D35A8B"/>
-    <w:rsid w:val="00D93F37"/>
-    <w:rsid w:val="00DA400E"/>
-    <w:rsid w:val="00F01575"/>
-    <w:rsid w:val="00F10424"/>
-    <w:rsid w:val="00F94CCD"/>
-  </w:rsids>
-  <m:mathPr>
-    <m:mathFont m:val="Cambria Math"/>
-    <m:brkBin m:val="before"/>
-    <m:brkBinSub m:val="--"/>
-    <m:smallFrac m:val="0"/>
-    <m:dispDef/>
-    <m:lMargin m:val="0"/>
-    <m:rMargin m:val="0"/>
-    <m:defJc m:val="centerGroup"/>
-    <m:wrapIndent m:val="1440"/>
-    <m:intLim m:val="subSup"/>
-    <m:naryLim m:val="undOvr"/>
-  </m:mathPr>
-  <w:themeFontLang w:val="es-AR"/>
-  <w:clrSchemeMapping w:bg1="light1" w:t1="dark1" w:bg2="light2" w:t2="dark2" w:accent1="accent1" w:accent2="accent2" w:accent3="accent3" w:accent4="accent4" w:accent5="accent5" w:accent6="accent6" w:hyperlink="hyperlink" w:followedHyperlink="followedHyperlink"/>
-  <w:decimalSymbol w:val=","/>
-  <w:listSeparator w:val=";"/>
-  <w15:chartTrackingRefBased/>
-</w:settings>
-</file>
-
-<file path=word/glossary/styles.xml><?xml version="1.0" encoding="utf-8"?>
-<w:styles xmlns:mc="http://schemas.openxmlformats.org/markup-compatibility/2006" xmlns:r="http://schemas.openxmlformats.org/officeDocument/2006/relationships" xmlns:w="http://schemas.openxmlformats.org/wordprocessingml/2006/main" xmlns:w14="http://schemas.microsoft.com/office/word/2010/wordml" xmlns:w15="http://schemas.microsoft.com/office/word/2012/wordml" xmlns:w16cex="http://schemas.microsoft.com/office/word/2018/wordml/cex" xmlns:w16cid="http://schemas.microsoft.com/office/word/2016/wordml/cid" xmlns:w16="http://schemas.microsoft.com/office/word/2018/wordml" xmlns:w16du="http://schemas.microsoft.com/office/word/2023/wordml/word16du" xmlns:w16sdtdh="http://schemas.microsoft.com/office/word/2020/wordml/sdtdatahash" xmlns:w16sdtfl="http://schemas.microsoft.com/office/word/2024/wordml/sdtformatlock" xmlns:w16se="http://schemas.microsoft.com/office/word/2015/wordml/symex" mc:Ignorable="w14 w15 w16se w16cid w16 w16cex w16sdtdh w16sdtfl w16du">
-  <w:docDefaults>
-    <w:rPrDefault>
-      <w:rPr>
-        <w:rFonts w:asciiTheme="minorHAnsi" w:eastAsiaTheme="minorEastAsia" w:hAnsiTheme="minorHAnsi" w:cstheme="minorBidi"/>
-        <w:kern w:val="2"/>
-        <w:sz w:val="24"/>
-        <w:szCs w:val="24"/>
-        <w:lang w:val="es-AR" w:eastAsia="es-AR" w:bidi="ar-SA"/>
-        <w14:ligatures w14:val="standardContextual"/>
-      </w:rPr>
-    </w:rPrDefault>
-    <w:pPrDefault>
-      <w:pPr>
-        <w:spacing w:after="160" w:line="278" w:lineRule="auto"/>
-      </w:pPr>
-    </w:pPrDefault>
-  </w:docDefaults>
-  <w:latentStyles w:defLockedState="0" w:defUIPriority="99" w:defSemiHidden="0" w:defUnhideWhenUsed="0" w:defQFormat="0" w:count="376">
-    <w:lsdException w:name="Normal" w:uiPriority="0" w:qFormat="1"/>
-    <w:lsdException w:name="heading 1" w:uiPriority="9" w:qFormat="1"/>
-    <w:lsdException w:name="heading 2" w:semiHidden="1" w:uiPriority="9" w:unhideWhenUsed="1" w:qFormat="1"/>
-    <w:lsdException w:name="heading 3" w:semiHidden="1" w:uiPriority="9" w:unhideWhenUsed="1" w:qFormat="1"/>
-    <w:lsdException w:name="heading 4" w:semiHidden="1" w:uiPriority="9" w:unhideWhenUsed="1" w:qFormat="1"/>
-    <w:lsdException w:name="heading 5" w:semiHidden="1" w:uiPriority="9" w:unhideWhenUsed="1" w:qFormat="1"/>
-    <w:lsdException w:name="heading 6" w:semiHidden="1" w:uiPriority="9" w:unhideWhenUsed="1" w:qFormat="1"/>
-    <w:lsdException w:name="heading 7" w:semiHidden="1" w:uiPriority="9" w:unhideWhenUsed="1" w:qFormat="1"/>
-    <w:lsdException w:name="heading 8" w:semiHidden="1" w:uiPriority="9" w:unhideWhenUsed="1" w:qFormat="1"/>
-    <w:lsdException w:name="heading 9" w:semiHidden="1" w:uiPriority="9" w:unhideWhenUsed="1" w:qFormat="1"/>
-    <w:lsdException w:name="index 1" w:semiHidden="1" w:unhideWhenUsed="1"/>
-    <w:lsdException w:name="index 2" w:semiHidden="1" w:unhideWhenUsed="1"/>
-    <w:lsdException w:name="index 3" w:semiHidden="1" w:unhideWhenUsed="1"/>
-    <w:lsdException w:name="index 4" w:semiHidden="1" w:unhideWhenUsed="1"/>
-    <w:lsdException w:name="index 5" w:semiHidden="1" w:unhideWhenUsed="1"/>
-    <w:lsdException w:name="index 6" w:semiHidden="1" w:unhideWhenUsed="1"/>
-    <w:lsdException w:name="index 7" w:semiHidden="1" w:unhideWhenUsed="1"/>
-    <w:lsdException w:name="index 8" w:semiHidden="1" w:unhideWhenUsed="1"/>
-    <w:lsdException w:name="index 9" w:semiHidden="1" w:unhideWhenUsed="1"/>
-    <w:lsdException w:name="toc 1" w:semiHidden="1" w:uiPriority="39" w:unhideWhenUsed="1"/>
-    <w:lsdException w:name="toc 2" w:semiHidden="1" w:uiPriority="39" w:unhideWhenUsed="1"/>
-    <w:lsdException w:name="toc 3" w:semiHidden="1" w:uiPriority="39" w:unhideWhenUsed="1"/>
-    <w:lsdException w:name="toc 4" w:semiHidden="1" w:uiPriority="39" w:unhideWhenUsed="1"/>
-    <w:lsdException w:name="toc 5" w:semiHidden="1" w:uiPriority="39" w:unhideWhenUsed="1"/>
-    <w:lsdException w:name="toc 6" w:semiHidden="1" w:uiPriority="39" w:unhideWhenUsed="1"/>
-    <w:lsdException w:name="toc 7" w:semiHidden="1" w:uiPriority="39" w:unhideWhenUsed="1"/>
-    <w:lsdException w:name="toc 8" w:semiHidden="1" w:uiPriority="39" w:unhideWhenUsed="1"/>
-    <w:lsdException w:name="toc 9" w:semiHidden="1" w:uiPriority="39" w:unhideWhenUsed="1"/>
-    <w:lsdException w:name="Normal Indent" w:semiHidden="1" w:unhideWhenUsed="1"/>
-    <w:lsdException w:name="footnote text" w:semiHidden="1" w:unhideWhenUsed="1"/>
-    <w:lsdException w:name="annotation text" w:semiHidden="1" w:unhideWhenUsed="1"/>
-    <w:lsdException w:name="header" w:semiHidden="1" w:unhideWhenUsed="1"/>
-    <w:lsdException w:name="footer" w:semiHidden="1" w:unhideWhenUsed="1"/>
-    <w:lsdException w:name="index heading" w:semiHidden="1" w:unhideWhenUsed="1"/>
-    <w:lsdException w:name="caption" w:semiHidden="1" w:uiPriority="35" w:unhideWhenUsed="1" w:qFormat="1"/>
-    <w:lsdException w:name="table of figures" w:semiHidden="1" w:unhideWhenUsed="1"/>
-    <w:lsdException w:name="envelope address" w:semiHidden="1" w:unhideWhenUsed="1"/>
-    <w:lsdException w:name="envelope return" w:semiHidden="1" w:unhideWhenUsed="1"/>
-    <w:lsdException w:name="footnote reference" w:semiHidden="1" w:unhideWhenUsed="1"/>
-    <w:lsdException w:name="annotation reference" w:semiHidden="1" w:unhideWhenUsed="1"/>
-    <w:lsdException w:name="line number" w:semiHidden="1" w:unhideWhenUsed="1"/>
-    <w:lsdException w:name="page number" w:semiHidden="1" w:unhideWhenUsed="1"/>
-    <w:lsdException w:name="endnote reference" w:semiHidden="1" w:unhideWhenUsed="1"/>
-    <w:lsdException w:name="endnote text" w:semiHidden="1" w:unhideWhenUsed="1"/>
-    <w:lsdException w:name="table of authorities" w:semiHidden="1" w:unhideWhenUsed="1"/>
-    <w:lsdException w:name="macro" w:semiHidden="1" w:unhideWhenUsed="1"/>
-    <w:lsdException w:name="toa heading" w:semiHidden="1" w:unhideWhenUsed="1"/>
-    <w:lsdException w:name="List" w:semiHidden="1" w:unhideWhenUsed="1"/>
-    <w:lsdException w:name="List Bullet" w:semiHidden="1" w:unhideWhenUsed="1"/>
-    <w:lsdException w:name="List Number" w:semiHidden="1" w:unhideWhenUsed="1"/>
-    <w:lsdException w:name="List 2" w:semiHidden="1" w:unhideWhenUsed="1"/>
-    <w:lsdException w:name="List 3" w:semiHidden="1" w:unhideWhenUsed="1"/>
-    <w:lsdException w:name="List 4" w:semiHidden="1" w:unhideWhenUsed="1"/>
-    <w:lsdException w:name="List 5" w:semiHidden="1" w:unhideWhenUsed="1"/>
-    <w:lsdException w:name="List Bullet 2" w:semiHidden="1" w:unhideWhenUsed="1"/>
-    <w:lsdException w:name="List Bullet 3" w:semiHidden="1" w:unhideWhenUsed="1"/>
-    <w:lsdException w:name="List Bullet 4" w:semiHidden="1" w:unhideWhenUsed="1"/>
-    <w:lsdException w:name="List Bullet 5" w:semiHidden="1" w:unhideWhenUsed="1"/>
-    <w:lsdException w:name="List Number 2" w:semiHidden="1" w:unhideWhenUsed="1"/>
-    <w:lsdException w:name="List Number 3" w:semiHidden="1" w:unhideWhenUsed="1"/>
-    <w:lsdException w:name="List Number 4" w:semiHidden="1" w:unhideWhenUsed="1"/>
-    <w:lsdException w:name="List Number 5" w:semiHidden="1" w:unhideWhenUsed="1"/>
-    <w:lsdException w:name="Title" w:uiPriority="10" w:qFormat="1"/>
-    <w:lsdException w:name="Closing" w:semiHidden="1" w:unhideWhenUsed="1"/>
-    <w:lsdException w:name="Signature" w:semiHidden="1" w:unhideWhenUsed="1"/>
-    <w:lsdException w:name="Default Paragraph Font" w:semiHidden="1" w:uiPriority="1" w:unhideWhenUsed="1"/>
-    <w:lsdException w:name="Body Text" w:semiHidden="1" w:unhideWhenUsed="1"/>
-    <w:lsdException w:name="Body Text Indent" w:semiHidden="1" w:unhideWhenUsed="1"/>
-    <w:lsdException w:name="List Continue" w:semiHidden="1" w:unhideWhenUsed="1"/>
-    <w:lsdException w:name="List Continue 2" w:semiHidden="1" w:unhideWhenUsed="1"/>
-    <w:lsdException w:name="List Continue 3" w:semiHidden="1" w:unhideWhenUsed="1"/>
-    <w:lsdException w:name="List Continue 4" w:semiHidden="1" w:unhideWhenUsed="1"/>
-    <w:lsdException w:name="List Continue 5" w:semiHidden="1" w:unhideWhenUsed="1"/>
-    <w:lsdException w:name="Message Header" w:semiHidden="1" w:unhideWhenUsed="1"/>
-    <w:lsdException w:name="Subtitle" w:uiPriority="11" w:qFormat="1"/>
-    <w:lsdException w:name="Salutation" w:semiHidden="1" w:unhideWhenUsed="1"/>
-    <w:lsdException w:name="Date" w:semiHidden="1" w:unhideWhenUsed="1"/>
-    <w:lsdException w:name="Body Text First Indent" w:semiHidden="1" w:unhideWhenUsed="1"/>
-    <w:lsdException w:name="Body Text First Indent 2" w:semiHidden="1" w:unhideWhenUsed="1"/>
-    <w:lsdException w:name="Note Heading" w:semiHidden="1" w:unhideWhenUsed="1"/>
-    <w:lsdException w:name="Body Text 2" w:semiHidden="1" w:unhideWhenUsed="1"/>
-    <w:lsdException w:name="Body Text 3" w:semiHidden="1" w:unhideWhenUsed="1"/>
-    <w:lsdException w:name="Body Text Indent 2" w:semiHidden="1" w:unhideWhenUsed="1"/>
-    <w:lsdException w:name="Body Text Indent 3" w:semiHidden="1" w:unhideWhenUsed="1"/>
-    <w:lsdException w:name="Block Text" w:semiHidden="1" w:unhideWhenUsed="1"/>
-    <w:lsdException w:name="Hyperlink" w:semiHidden="1" w:unhideWhenUsed="1"/>
-    <w:lsdException w:name="FollowedHyperlink" w:semiHidden="1" w:unhideWhenUsed="1"/>
-    <w:lsdException w:name="Strong" w:uiPriority="22" w:qFormat="1"/>
-    <w:lsdException w:name="Emphasis" w:uiPriority="20" w:qFormat="1"/>
-    <w:lsdException w:name="Document Map" w:semiHidden="1" w:unhideWhenUsed="1"/>
-    <w:lsdException w:name="Plain Text" w:semiHidden="1" w:unhideWhenUsed="1"/>
-    <w:lsdException w:name="E-mail Signature" w:semiHidden="1" w:unhideWhenUsed="1"/>
-    <w:lsdException w:name="HTML Top of Form" w:semiHidden="1" w:unhideWhenUsed="1"/>
-    <w:lsdException w:name="HTML Bottom of Form" w:semiHidden="1" w:unhideWhenUsed="1"/>
-    <w:lsdException w:name="Normal (Web)" w:semiHidden="1" w:unhideWhenUsed="1"/>
-    <w:lsdException w:name="HTML Acronym" w:semiHidden="1" w:unhideWhenUsed="1"/>
-    <w:lsdException w:name="HTML Address" w:semiHidden="1" w:unhideWhenUsed="1"/>
-    <w:lsdException w:name="HTML Cite" w:semiHidden="1" w:unhideWhenUsed="1"/>
-    <w:lsdException w:name="HTML Code" w:semiHidden="1" w:unhideWhenUsed="1"/>
-    <w:lsdException w:name="HTML Definition" w:semiHidden="1" w:unhideWhenUsed="1"/>
-    <w:lsdException w:name="HTML Keyboard" w:semiHidden="1" w:unhideWhenUsed="1"/>
-    <w:lsdException w:name="HTML Preformatted" w:semiHidden="1" w:unhideWhenUsed="1"/>
-    <w:lsdException w:name="HTML Sample" w:semiHidden="1" w:unhideWhenUsed="1"/>
-    <w:lsdException w:name="HTML Typewriter" w:semiHidden="1" w:unhideWhenUsed="1"/>
-    <w:lsdException w:name="HTML Variable" w:semiHidden="1" w:unhideWhenUsed="1"/>
-    <w:lsdException w:name="Normal Table" w:semiHidden="1" w:unhideWhenUsed="1"/>
-    <w:lsdException w:name="annotation subject" w:semiHidden="1" w:unhideWhenUsed="1"/>
-    <w:lsdException w:name="No List" w:semiHidden="1" w:unhideWhenUsed="1"/>
-    <w:lsdException w:name="Outline List 1" w:semiHidden="1" w:unhideWhenUsed="1"/>
-    <w:lsdException w:name="Outline List 2" w:semiHidden="1" w:unhideWhenUsed="1"/>
-    <w:lsdException w:name="Outline List 3" w:semiHidden="1" w:unhideWhenUsed="1"/>
-    <w:lsdException w:name="Table Simple 1" w:semiHidden="1" w:unhideWhenUsed="1"/>
-    <w:lsdException w:name="Table Simple 2" w:semiHidden="1" w:unhideWhenUsed="1"/>
-    <w:lsdException w:name="Table Simple 3" w:semiHidden="1" w:unhideWhenUsed="1"/>
-    <w:lsdException w:name="Table Classic 1" w:semiHidden="1" w:unhideWhenUsed="1"/>
-    <w:lsdException w:name="Table Classic 2" w:semiHidden="1" w:unhideWhenUsed="1"/>
-    <w:lsdException w:name="Table Classic 3" w:semiHidden="1" w:unhideWhenUsed="1"/>
-    <w:lsdException w:name="Table Classic 4" w:semiHidden="1" w:unhideWhenUsed="1"/>
-    <w:lsdException w:name="Table Colorful 1" w:semiHidden="1" w:unhideWhenUsed="1"/>
-    <w:lsdException w:name="Table Colorful 2" w:semiHidden="1" w:unhideWhenUsed="1"/>
-    <w:lsdException w:name="Table Colorful 3" w:semiHidden="1" w:unhideWhenUsed="1"/>
-    <w:lsdException w:name="Table Columns 1" w:semiHidden="1" w:unhideWhenUsed="1"/>
-    <w:lsdException w:name="Table Columns 2" w:semiHidden="1" w:unhideWhenUsed="1"/>
-    <w:lsdException w:name="Table Columns 3" w:semiHidden="1" w:unhideWhenUsed="1"/>
-    <w:lsdException w:name="Table Columns 4" w:semiHidden="1" w:unhideWhenUsed="1"/>
-    <w:lsdException w:name="Table Columns 5" w:semiHidden="1" w:unhideWhenUsed="1"/>
-    <w:lsdException w:name="Table Grid 1" w:semiHidden="1" w:unhideWhenUsed="1"/>
-    <w:lsdException w:name="Table Grid 2" w:semiHidden="1" w:unhideWhenUsed="1"/>
-    <w:lsdException w:name="Table Grid 3" w:semiHidden="1" w:unhideWhenUsed="1"/>
-    <w:lsdException w:name="Table Grid 4" w:semiHidden="1" w:unhideWhenUsed="1"/>
-    <w:lsdException w:name="Table Grid 5" w:semiHidden="1" w:unhideWhenUsed="1"/>
-    <w:lsdException w:name="Table Grid 6" w:semiHidden="1" w:unhideWhenUsed="1"/>
-    <w:lsdException w:name="Table Grid 7" w:semiHidden="1" w:unhideWhenUsed="1"/>
-    <w:lsdException w:name="Table Grid 8" w:semiHidden="1" w:unhideWhenUsed="1"/>
-    <w:lsdException w:name="Table List 1" w:semiHidden="1" w:unhideWhenUsed="1"/>
-    <w:lsdException w:name="Table List 2" w:semiHidden="1" w:unhideWhenUsed="1"/>
-    <w:lsdException w:name="Table List 3" w:semiHidden="1" w:unhideWhenUsed="1"/>
-    <w:lsdException w:name="Table List 4" w:semiHidden="1" w:unhideWhenUsed="1"/>
-    <w:lsdException w:name="Table List 5" w:semiHidden="1" w:unhideWhenUsed="1"/>
-    <w:lsdException w:name="Table List 6" w:semiHidden="1" w:unhideWhenUsed="1"/>
-    <w:lsdException w:name="Table List 7" w:semiHidden="1" w:unhideWhenUsed="1"/>
-    <w:lsdException w:name="Table List 8" w:semiHidden="1" w:unhideWhenUsed="1"/>
-    <w:lsdException w:name="Table 3D effects 1" w:semiHidden="1" w:unhideWhenUsed="1"/>
-    <w:lsdException w:name="Table 3D effects 2" w:semiHidden="1" w:unhideWhenUsed="1"/>
-    <w:lsdException w:name="Table 3D effects 3" w:semiHidden="1" w:unhideWhenUsed="1"/>
-    <w:lsdException w:name="Table Contemporary" w:semiHidden="1" w:unhideWhenUsed="1"/>
-    <w:lsdException w:name="Table Elegant" w:semiHidden="1" w:unhideWhenUsed="1"/>
-    <w:lsdException w:name="Table Professional" w:semiHidden="1" w:unhideWhenUsed="1"/>
-    <w:lsdException w:name="Table Subtle 1" w:semiHidden="1" w:unhideWhenUsed="1"/>
-    <w:lsdException w:name="Table Subtle 2" w:semiHidden="1" w:unhideWhenUsed="1"/>
-    <w:lsdException w:name="Table Web 1" w:semiHidden="1" w:unhideWhenUsed="1"/>
-    <w:lsdException w:name="Table Web 2" w:semiHidden="1" w:unhideWhenUsed="1"/>
-    <w:lsdException w:name="Table Web 3" w:semiHidden="1" w:unhideWhenUsed="1"/>
-    <w:lsdException w:name="Balloon Text" w:semiHidden="1" w:unhideWhenUsed="1"/>
-    <w:lsdException w:name="Table Grid" w:uiPriority="39"/>
-    <w:lsdException w:name="Table Theme" w:semiHidden="1" w:unhideWhenUsed="1"/>
-    <w:lsdException w:name="Placeholder Text" w:semiHidden="1"/>
-    <w:lsdException w:name="No Spacing" w:uiPriority="1" w:qFormat="1"/>
-    <w:lsdException w:name="Light Shading" w:uiPriority="60"/>
-    <w:lsdException w:name="Light List" w:uiPriority="61"/>
-    <w:lsdException w:name="Light Grid" w:uiPriority="62"/>
-    <w:lsdException w:name="Medium Shading 1" w:uiPriority="63"/>
-    <w:lsdException w:name="Medium Shading 2" w:uiPriority="64"/>
-    <w:lsdException w:name="Medium List 1" w:uiPriority="65"/>
-    <w:lsdException w:name="Medium List 2" w:uiPriority="66"/>
-    <w:lsdException w:name="Medium Grid 1" w:uiPriority="67"/>
-    <w:lsdException w:name="Medium Grid 2" w:uiPriority="68"/>
-    <w:lsdException w:name="Medium Grid 3" w:uiPriority="69"/>
-    <w:lsdException w:name="Dark List" w:uiPriority="70"/>
-    <w:lsdException w:name="Colorful Shading" w:uiPriority="71"/>
-    <w:lsdException w:name="Colorful List" w:uiPriority="72"/>
-    <w:lsdException w:name="Colorful Grid" w:uiPriority="73"/>
-    <w:lsdException w:name="Light Shading Accent 1" w:uiPriority="60"/>
-    <w:lsdException w:name="Light List Accent 1" w:uiPriority="61"/>
-    <w:lsdException w:name="Light Grid Accent 1" w:uiPriority="62"/>
-    <w:lsdException w:name="Medium Shading 1 Accent 1" w:uiPriority="63"/>
-    <w:lsdException w:name="Medium Shading 2 Accent 1" w:uiPriority="64"/>
-    <w:lsdException w:name="Medium List 1 Accent 1" w:uiPriority="65"/>
-    <w:lsdException w:name="Revision" w:semiHidden="1"/>
-    <w:lsdException w:name="List Paragraph" w:uiPriority="34" w:qFormat="1"/>
-    <w:lsdException w:name="Quote" w:uiPriority="29" w:qFormat="1"/>
-    <w:lsdException w:name="Intense Quote" w:uiPriority="30" w:qFormat="1"/>
-    <w:lsdException w:name="Medium List 2 Accent 1" w:uiPriority="66"/>
-    <w:lsdException w:name="Medium Grid 1 Accent 1" w:uiPriority="67"/>
-    <w:lsdException w:name="Medium Grid 2 Accent 1" w:uiPriority="68"/>
-    <w:lsdException w:name="Medium Grid 3 Accent 1" w:uiPriority="69"/>
-    <w:lsdException w:name="Dark List Accent 1" w:uiPriority="70"/>
-    <w:lsdException w:name="Colorful Shading Accent 1" w:uiPriority="71"/>
-    <w:lsdException w:name="Colorful List Accent 1" w:uiPriority="72"/>
-    <w:lsdException w:name="Colorful Grid Accent 1" w:uiPriority="73"/>
-    <w:lsdException w:name="Light Shading Accent 2" w:uiPriority="60"/>
-    <w:lsdException w:name="Light List Accent 2" w:uiPriority="61"/>
-    <w:lsdException w:name="Light Grid Accent 2" w:uiPriority="62"/>
-    <w:lsdException w:name="Medium Shading 1 Accent 2" w:uiPriority="63"/>
-    <w:lsdException w:name="Medium Shading 2 Accent 2" w:uiPriority="64"/>
-    <w:lsdException w:name="Medium List 1 Accent 2" w:uiPriority="65"/>
-    <w:lsdException w:name="Medium List 2 Accent 2" w:uiPriority="66"/>
-    <w:lsdException w:name="Medium Grid 1 Accent 2" w:uiPriority="67"/>
-    <w:lsdException w:name="Medium Grid 2 Accent 2" w:uiPriority="68"/>
-    <w:lsdException w:name="Medium Grid 3 Accent 2" w:uiPriority="69"/>
-    <w:lsdException w:name="Dark List Accent 2" w:uiPriority="70"/>
-    <w:lsdException w:name="Colorful Shading Accent 2" w:uiPriority="71"/>
-    <w:lsdException w:name="Colorful List Accent 2" w:uiPriority="72"/>
-    <w:lsdException w:name="Colorful Grid Accent 2" w:uiPriority="73"/>
-    <w:lsdException w:name="Light Shading Accent 3" w:uiPriority="60"/>
-    <w:lsdException w:name="Light List Accent 3" w:uiPriority="61"/>
-    <w:lsdException w:name="Light Grid Accent 3" w:uiPriority="62"/>
-    <w:lsdException w:name="Medium Shading 1 Accent 3" w:uiPriority="63"/>
-    <w:lsdException w:name="Medium Shading 2 Accent 3" w:uiPriority="64"/>
-    <w:lsdException w:name="Medium List 1 Accent 3" w:uiPriority="65"/>
-    <w:lsdException w:name="Medium List 2 Accent 3" w:uiPriority="66"/>
-    <w:lsdException w:name="Medium Grid 1 Accent 3" w:uiPriority="67"/>
-    <w:lsdException w:name="Medium Grid 2 Accent 3" w:uiPriority="68"/>
-    <w:lsdException w:name="Medium Grid 3 Accent 3" w:uiPriority="69"/>
-    <w:lsdException w:name="Dark List Accent 3" w:uiPriority="70"/>
-    <w:lsdException w:name="Colorful Shading Accent 3" w:uiPriority="71"/>
-    <w:lsdException w:name="Colorful List Accent 3" w:uiPriority="72"/>
-    <w:lsdException w:name="Colorful Grid Accent 3" w:uiPriority="73"/>
-    <w:lsdException w:name="Light Shading Accent 4" w:uiPriority="60"/>
-    <w:lsdException w:name="Light List Accent 4" w:uiPriority="61"/>
-    <w:lsdException w:name="Light Grid Accent 4" w:uiPriority="62"/>
-    <w:lsdException w:name="Medium Shading 1 Accent 4" w:uiPriority="63"/>
-    <w:lsdException w:name="Medium Shading 2 Accent 4" w:uiPriority="64"/>
-    <w:lsdException w:name="Medium List 1 Accent 4" w:uiPriority="65"/>
-    <w:lsdException w:name="Medium List 2 Accent 4" w:uiPriority="66"/>
-    <w:lsdException w:name="Medium Grid 1 Accent 4" w:uiPriority="67"/>
-    <w:lsdException w:name="Medium Grid 2 Accent 4" w:uiPriority="68"/>
-    <w:lsdException w:name="Medium Grid 3 Accent 4" w:uiPriority="69"/>
-    <w:lsdException w:name="Dark List Accent 4" w:uiPriority="70"/>
-    <w:lsdException w:name="Colorful Shading Accent 4" w:uiPriority="71"/>
-    <w:lsdException w:name="Colorful List Accent 4" w:uiPriority="72"/>
-    <w:lsdException w:name="Colorful Grid Accent 4" w:uiPriority="73"/>
-    <w:lsdException w:name="Light Shading Accent 5" w:uiPriority="60"/>
-    <w:lsdException w:name="Light List Accent 5" w:uiPriority="61"/>
-    <w:lsdException w:name="Light Grid Accent 5" w:uiPriority="62"/>
-    <w:lsdException w:name="Medium Shading 1 Accent 5" w:uiPriority="63"/>
-    <w:lsdException w:name="Medium Shading 2 Accent 5" w:uiPriority="64"/>
-    <w:lsdException w:name="Medium List 1 Accent 5" w:uiPriority="65"/>
-    <w:lsdException w:name="Medium List 2 Accent 5" w:uiPriority="66"/>
-    <w:lsdException w:name="Medium Grid 1 Accent 5" w:uiPriority="67"/>
-    <w:lsdException w:name="Medium Grid 2 Accent 5" w:uiPriority="68"/>
-    <w:lsdException w:name="Medium Grid 3 Accent 5" w:uiPriority="69"/>
-    <w:lsdException w:name="Dark List Accent 5" w:uiPriority="70"/>
-    <w:lsdException w:name="Colorful Shading Accent 5" w:uiPriority="71"/>
-    <w:lsdException w:name="Colorful List Accent 5" w:uiPriority="72"/>
-    <w:lsdException w:name="Colorful Grid Accent 5" w:uiPriority="73"/>
-    <w:lsdException w:name="Light Shading Accent 6" w:uiPriority="60"/>
-    <w:lsdException w:name="Light List Accent 6" w:uiPriority="61"/>
-    <w:lsdException w:name="Light Grid Accent 6" w:uiPriority="62"/>
-    <w:lsdException w:name="Medium Shading 1 Accent 6" w:uiPriority="63"/>
-    <w:lsdException w:name="Medium Shading 2 Accent 6" w:uiPriority="64"/>
-    <w:lsdException w:name="Medium List 1 Accent 6" w:uiPriority="65"/>
-    <w:lsdException w:name="Medium List 2 Accent 6" w:uiPriority="66"/>
-    <w:lsdException w:name="Medium Grid 1 Accent 6" w:uiPriority="67"/>
-    <w:lsdException w:name="Medium Grid 2 Accent 6" w:uiPriority="68"/>
-    <w:lsdException w:name="Medium Grid 3 Accent 6" w:uiPriority="69"/>
-    <w:lsdException w:name="Dark List Accent 6" w:uiPriority="70"/>
-    <w:lsdException w:name="Colorful Shading Accent 6" w:uiPriority="71"/>
-    <w:lsdException w:name="Colorful List Accent 6" w:uiPriority="72"/>
-    <w:lsdException w:name="Colorful Grid Accent 6" w:uiPriority="73"/>
-    <w:lsdException w:name="Subtle Emphasis" w:uiPriority="19" w:qFormat="1"/>
-    <w:lsdException w:name="Intense Emphasis" w:uiPriority="21" w:qFormat="1"/>
-    <w:lsdException w:name="Subtle Reference" w:uiPriority="31" w:qFormat="1"/>
-    <w:lsdException w:name="Intense Reference" w:uiPriority="32" w:qFormat="1"/>
-    <w:lsdException w:name="Book Title" w:uiPriority="33" w:qFormat="1"/>
-    <w:lsdException w:name="Bibliography" w:semiHidden="1" w:uiPriority="37" w:unhideWhenUsed="1"/>
-    <w:lsdException w:name="TOC Heading" w:semiHidden="1" w:uiPriority="39" w:unhideWhenUsed="1" w:qFormat="1"/>
-    <w:lsdException w:name="Plain Table 1" w:uiPriority="41"/>
-    <w:lsdException w:name="Plain Table 2" w:uiPriority="42"/>
-    <w:lsdException w:name="Plain Table 3" w:uiPriority="43"/>
-    <w:lsdException w:name="Plain Table 4" w:uiPriority="44"/>
-    <w:lsdException w:name="Plain Table 5" w:uiPriority="45"/>
-    <w:lsdException w:name="Grid Table Light" w:uiPriority="40"/>
-    <w:lsdException w:name="Grid Table 1 Light" w:uiPriority="46"/>
-    <w:lsdException w:name="Grid Table 2" w:uiPriority="47"/>
-    <w:lsdException w:name="Grid Table 3" w:uiPriority="48"/>
-    <w:lsdException w:name="Grid Table 4" w:uiPriority="49"/>
-    <w:lsdException w:name="Grid Table 5 Dark" w:uiPriority="50"/>
-    <w:lsdException w:name="Grid Table 6 Colorful" w:uiPriority="51"/>
-    <w:lsdException w:name="Grid Table 7 Colorful" w:uiPriority="52"/>
-    <w:lsdException w:name="Grid Table 1 Light Accent 1" w:uiPriority="46"/>
-    <w:lsdException w:name="Grid Table 2 Accent 1" w:uiPriority="47"/>
-    <w:lsdException w:name="Grid Table 3 Accent 1" w:uiPriority="48"/>
-    <w:lsdException w:name="Grid Table 4 Accent 1" w:uiPriority="49"/>
-    <w:lsdException w:name="Grid Table 5 Dark Accent 1" w:uiPriority="50"/>
-    <w:lsdException w:name="Grid Table 6 Colorful Accent 1" w:uiPriority="51"/>
-    <w:lsdException w:name="Grid Table 7 Colorful Accent 1" w:uiPriority="52"/>
-    <w:lsdException w:name="Grid Table 1 Light Accent 2" w:uiPriority="46"/>
-    <w:lsdException w:name="Grid Table 2 Accent 2" w:uiPriority="47"/>
-    <w:lsdException w:name="Grid Table 3 Accent 2" w:uiPriority="48"/>
-    <w:lsdException w:name="Grid Table 4 Accent 2" w:uiPriority="49"/>
-    <w:lsdException w:name="Grid Table 5 Dark Accent 2" w:uiPriority="50"/>
-    <w:lsdException w:name="Grid Table 6 Colorful Accent 2" w:uiPriority="51"/>
-    <w:lsdException w:name="Grid Table 7 Colorful Accent 2" w:uiPriority="52"/>
-    <w:lsdException w:name="Grid Table 1 Light Accent 3" w:uiPriority="46"/>
-    <w:lsdException w:name="Grid Table 2 Accent 3" w:uiPriority="47"/>
-    <w:lsdException w:name="Grid Table 3 Accent 3" w:uiPriority="48"/>
-    <w:lsdException w:name="Grid Table 4 Accent 3" w:uiPriority="49"/>
-    <w:lsdException w:name="Grid Table 5 Dark Accent 3" w:uiPriority="50"/>
-    <w:lsdException w:name="Grid Table 6 Colorful Accent 3" w:uiPriority="51"/>
-    <w:lsdException w:name="Grid Table 7 Colorful Accent 3" w:uiPriority="52"/>
-    <w:lsdException w:name="Grid Table 1 Light Accent 4" w:uiPriority="46"/>
-    <w:lsdException w:name="Grid Table 2 Accent 4" w:uiPriority="47"/>
-    <w:lsdException w:name="Grid Table 3 Accent 4" w:uiPriority="48"/>
-    <w:lsdException w:name="Grid Table 4 Accent 4" w:uiPriority="49"/>
-    <w:lsdException w:name="Grid Table 5 Dark Accent 4" w:uiPriority="50"/>
-    <w:lsdException w:name="Grid Table 6 Colorful Accent 4" w:uiPriority="51"/>
-    <w:lsdException w:name="Grid Table 7 Colorful Accent 4" w:uiPriority="52"/>
-    <w:lsdException w:name="Grid Table 1 Light Accent 5" w:uiPriority="46"/>
-    <w:lsdException w:name="Grid Table 2 Accent 5" w:uiPriority="47"/>
-    <w:lsdException w:name="Grid Table 3 Accent 5" w:uiPriority="48"/>
-    <w:lsdException w:name="Grid Table 4 Accent 5" w:uiPriority="49"/>
-    <w:lsdException w:name="Grid Table 5 Dark Accent 5" w:uiPriority="50"/>
-    <w:lsdException w:name="Grid Table 6 Colorful Accent 5" w:uiPriority="51"/>
-    <w:lsdException w:name="Grid Table 7 Colorful Accent 5" w:uiPriority="52"/>
-    <w:lsdException w:name="Grid Table 1 Light Accent 6" w:uiPriority="46"/>
-    <w:lsdException w:name="Grid Table 2 Accent 6" w:uiPriority="47"/>
-    <w:lsdException w:name="Grid Table 3 Accent 6" w:uiPriority="48"/>
-    <w:lsdException w:name="Grid Table 4 Accent 6" w:uiPriority="49"/>
-    <w:lsdException w:name="Grid Table 5 Dark Accent 6" w:uiPriority="50"/>
-    <w:lsdException w:name="Grid Table 6 Colorful Accent 6" w:uiPriority="51"/>
-    <w:lsdException w:name="Grid Table 7 Colorful Accent 6" w:uiPriority="52"/>
-    <w:lsdException w:name="List Table 1 Light" w:uiPriority="46"/>
-    <w:lsdException w:name="List Table 2" w:uiPriority="47"/>
-    <w:lsdException w:name="List Table 3" w:uiPriority="48"/>
-    <w:lsdException w:name="List Table 4" w:uiPriority="49"/>
-    <w:lsdException w:name="List Table 5 Dark" w:uiPriority="50"/>
-    <w:lsdException w:name="List Table 6 Colorful" w:uiPriority="51"/>
-    <w:lsdException w:name="List Table 7 Colorful" w:uiPriority="52"/>
-    <w:lsdException w:name="List Table 1 Light Accent 1" w:uiPriority="46"/>
-    <w:lsdException w:name="List Table 2 Accent 1" w:uiPriority="47"/>
-    <w:lsdException w:name="List Table 3 Accent 1" w:uiPriority="48"/>
-    <w:lsdException w:name="List Table 4 Accent 1" w:uiPriority="49"/>
-    <w:lsdException w:name="List Table 5 Dark Accent 1" w:uiPriority="50"/>
-    <w:lsdException w:name="List Table 6 Colorful Accent 1" w:uiPriority="51"/>
-    <w:lsdException w:name="List Table 7 Colorful Accent 1" w:uiPriority="52"/>
-    <w:lsdException w:name="List Table 1 Light Accent 2" w:uiPriority="46"/>
-    <w:lsdException w:name="List Table 2 Accent 2" w:uiPriority="47"/>
-    <w:lsdException w:name="List Table 3 Accent 2" w:uiPriority="48"/>
-    <w:lsdException w:name="List Table 4 Accent 2" w:uiPriority="49"/>
-    <w:lsdException w:name="List Table 5 Dark Accent 2" w:uiPriority="50"/>
-    <w:lsdException w:name="List Table 6 Colorful Accent 2" w:uiPriority="51"/>
-    <w:lsdException w:name="List Table 7 Colorful Accent 2" w:uiPriority="52"/>
-    <w:lsdException w:name="List Table 1 Light Accent 3" w:uiPriority="46"/>
-    <w:lsdException w:name="List Table 2 Accent 3" w:uiPriority="47"/>
-    <w:lsdException w:name="List Table 3 Accent 3" w:uiPriority="48"/>
-    <w:lsdException w:name="List Table 4 Accent 3" w:uiPriority="49"/>
-    <w:lsdException w:name="List Table 5 Dark Accent 3" w:uiPriority="50"/>
-    <w:lsdException w:name="List Table 6 Colorful Accent 3" w:uiPriority="51"/>
-    <w:lsdException w:name="List Table 7 Colorful Accent 3" w:uiPriority="52"/>
-    <w:lsdException w:name="List Table 1 Light Accent 4" w:uiPriority="46"/>
-    <w:lsdException w:name="List Table 2 Accent 4" w:uiPriority="47"/>
-    <w:lsdException w:name="List Table 3 Accent 4" w:uiPriority="48"/>
-    <w:lsdException w:name="List Table 4 Accent 4" w:uiPriority="49"/>
-    <w:lsdException w:name="List Table 5 Dark Accent 4" w:uiPriority="50"/>
-    <w:lsdException w:name="List Table 6 Colorful Accent 4" w:uiPriority="51"/>
-    <w:lsdException w:name="List Table 7 Colorful Accent 4" w:uiPriority="52"/>
-    <w:lsdException w:name="List Table 1 Light Accent 5" w:uiPriority="46"/>
-    <w:lsdException w:name="List Table 2 Accent 5" w:uiPriority="47"/>
-    <w:lsdException w:name="List Table 3 Accent 5" w:uiPriority="48"/>
-    <w:lsdException w:name="List Table 4 Accent 5" w:uiPriority="49"/>
-    <w:lsdException w:name="List Table 5 Dark Accent 5" w:uiPriority="50"/>
-    <w:lsdException w:name="List Table 6 Colorful Accent 5" w:uiPriority="51"/>
-    <w:lsdException w:name="List Table 7 Colorful Accent 5" w:uiPriority="52"/>
-    <w:lsdException w:name="List Table 1 Light Accent 6" w:uiPriority="46"/>
-    <w:lsdException w:name="List Table 2 Accent 6" w:uiPriority="47"/>
-    <w:lsdException w:name="List Table 3 Accent 6" w:uiPriority="48"/>
-    <w:lsdException w:name="List Table 4 Accent 6" w:uiPriority="49"/>
-    <w:lsdException w:name="List Table 5 Dark Accent 6" w:uiPriority="50"/>
-    <w:lsdException w:name="List Table 6 Colorful Accent 6" w:uiPriority="51"/>
-    <w:lsdException w:name="List Table 7 Colorful Accent 6" w:uiPriority="52"/>
-    <w:lsdException w:name="Mention" w:semiHidden="1" w:unhideWhenUsed="1"/>
-    <w:lsdException w:name="Smart Hyperlink" w:semiHidden="1" w:unhideWhenUsed="1"/>
-    <w:lsdException w:name="Hashtag" w:semiHidden="1" w:unhideWhenUsed="1"/>
-    <w:lsdException w:name="Unresolved Mention" w:semiHidden="1" w:unhideWhenUsed="1"/>
-    <w:lsdException w:name="Smart Link" w:semiHidden="1" w:unhideWhenUsed="1"/>
-  </w:latentStyles>
-  <w:style w:type="paragraph" w:default="1" w:styleId="Normal">
-    <w:name w:val="Normal"/>
-    <w:qFormat/>
-  </w:style>
-  <w:style w:type="character" w:default="1" w:styleId="Fuentedeprrafopredeter">
-    <w:name w:val="Default Paragraph Font"/>
-    <w:uiPriority w:val="1"/>
-    <w:semiHidden/>
-    <w:unhideWhenUsed/>
-  </w:style>
-  <w:style w:type="table" w:default="1" w:styleId="Tablanormal">
-    <w:name w:val="Normal Table"/>
-    <w:uiPriority w:val="99"/>
-    <w:semiHidden/>
-    <w:unhideWhenUsed/>
-    <w:tblPr>
-      <w:tblInd w:w="0" w:type="dxa"/>
-      <w:tblCellMar>
-        <w:top w:w="0" w:type="dxa"/>
-        <w:left w:w="108" w:type="dxa"/>
-        <w:bottom w:w="0" w:type="dxa"/>
-        <w:right w:w="108" w:type="dxa"/>
-      </w:tblCellMar>
-    </w:tblPr>
-  </w:style>
-  <w:style w:type="numbering" w:default="1" w:styleId="Sinlista">
-    <w:name w:val="No List"/>
-    <w:uiPriority w:val="99"/>
-    <w:semiHidden/>
-    <w:unhideWhenUsed/>
-  </w:style>
-  <w:style w:type="character" w:styleId="Textodelmarcadordeposicin">
-    <w:name w:val="Placeholder Text"/>
-    <w:basedOn w:val="Fuentedeprrafopredeter"/>
-    <w:uiPriority w:val="99"/>
-    <w:semiHidden/>
-    <w:rsid w:val="00814096"/>
-    <w:rPr>
-      <w:color w:val="666666"/>
-    </w:rPr>
-  </w:style>
-  <w:style w:type="paragraph" w:customStyle="1" w:styleId="550971BDE7944E54A46C5B14740AD647">
-    <w:name w:val="550971BDE7944E54A46C5B14740AD647"/>
-    <w:rsid w:val="00814096"/>
-    <w:pPr>
-      <w:spacing w:after="200" w:line="276" w:lineRule="auto"/>
-    </w:pPr>
-    <w:rPr>
-      <w:rFonts w:ascii="Calibri" w:eastAsia="Calibri" w:hAnsi="Calibri" w:cs="Calibri"/>
-      <w:kern w:val="0"/>
-      <w:sz w:val="22"/>
-      <w:szCs w:val="22"/>
-      <w14:ligatures w14:val="none"/>
-    </w:rPr>
-  </w:style>
-</w:styles>
-</file>
-
-<file path=word/glossary/webSettings.xml><?xml version="1.0" encoding="utf-8"?>
-<w:webSettings xmlns:mc="http://schemas.openxmlformats.org/markup-compatibility/2006" xmlns:r="http://schemas.openxmlformats.org/officeDocument/2006/relationships" xmlns:w="http://schemas.openxmlformats.org/wordprocessingml/2006/main" xmlns:w14="http://schemas.microsoft.com/office/word/2010/wordml" xmlns:w15="http://schemas.microsoft.com/office/word/2012/wordml" xmlns:w16cex="http://schemas.microsoft.com/office/word/2018/wordml/cex" xmlns:w16cid="http://schemas.microsoft.com/office/word/2016/wordml/cid" xmlns:w16="http://schemas.microsoft.com/office/word/2018/wordml" xmlns:w16du="http://schemas.microsoft.com/office/word/2023/wordml/word16du" xmlns:w16sdtdh="http://schemas.microsoft.com/office/word/2020/wordml/sdtdatahash" xmlns:w16sdtfl="http://schemas.microsoft.com/office/word/2024/wordml/sdtformatlock" xmlns:w16se="http://schemas.microsoft.com/office/word/2015/wordml/symex" mc:Ignorable="w14 w15 w16se w16cid w16 w16cex w16sdtdh w16sdtfl w16du">
-  <w:optimizeForBrowser/>
-  <w:allowPNG/>
-</w:webSettings>
-</file>
-
 <file path=word/theme/theme1.xml><?xml version="1.0" encoding="utf-8"?>
 <a:theme xmlns:a="http://schemas.openxmlformats.org/drawingml/2006/main" name="Office Theme">
   <a:themeElements>

</xml_diff>